<commit_message>
Highlight Project Name on the leftover blank agreement PDF.
The Word download leftover already shipped; keep the committed blank PDF (and the van-original-blank source it is printed from) showing the same yellow Project Name field instead of Multi-Project Relocation Agreement.

Co-authored-by: vanpittman12 <vanpittman12@users.noreply.github.com>
</commit_message>
<xml_diff>
--- a/content/agreements/van-original-blank.docx
+++ b/content/agreements/van-original-blank.docx
@@ -93,7 +93,10 @@
         <w:jc w:val="center"/>
       </w:pPr>
       <w:r>
-        <w:t>Multi-Project Relocation Agreement</w:t>
+        <w:rPr>
+          <w:highlight w:val="yellow"/>
+        </w:rPr>
+        <w:t>Project Name</w:t>
       </w:r>
     </w:p>
     <w:p>

</xml_diff>

<commit_message>
Show highlighted Project Name on the blank agreement PDF (#63)
The Word download leftover already shipped; keep the committed blank PDF (and the van-original-blank source it is printed from) showing the same yellow Project Name field instead of Multi-Project Relocation Agreement.

Co-authored-by: Cursor Agent <cursoragent@cursor.com>
Co-authored-by: vanpittman12 <vanpittman12@users.noreply.github.com>
</commit_message>
<xml_diff>
--- a/content/agreements/van-original-blank.docx
+++ b/content/agreements/van-original-blank.docx
@@ -93,7 +93,10 @@
         <w:jc w:val="center"/>
       </w:pPr>
       <w:r>
-        <w:t>Multi-Project Relocation Agreement</w:t>
+        <w:rPr>
+          <w:highlight w:val="yellow"/>
+        </w:rPr>
+        <w:t>Project Name</w:t>
       </w:r>
     </w:p>
     <w:p>

</xml_diff>